<commit_message>
docs: add CI/CD regression demonstration to test summary report
Added Section 9 documenting the fail/fix/pass regression demonstration
flow for the GitHub Actions pipeline, fulfilling Person 3's final
assignment requirement. Also regenerated the Word copy.
</commit_message>
<xml_diff>
--- a/docs/docx/test_summary_report.docx
+++ b/docs/docx/test_summary_report.docx
@@ -5611,7 +5611,160 @@
         <w:pStyle w:val="Heading1"/>
       </w:pPr>
       <w:r>
-        <w:t>9. Conclusion</w:t>
+        <w:t>9. CI/CD Regression Demonstration</w:t>
+      </w:r>
+    </w:p>
+    <w:p>
+      <w:r>
+        <w:t xml:space="preserve">As part of the continuous integration setup (GitHub Actions), a regression demonstration was performed to prove that the pipeline reliably catches newly introduced bugs and guards the </w:t>
+      </w:r>
+      <w:r>
+        <w:rPr>
+          <w:rFonts w:ascii="Consolas" w:hAnsi="Consolas"/>
+          <w:color w:val="B03060"/>
+        </w:rPr>
+        <w:t>main</w:t>
+      </w:r>
+      <w:r>
+        <w:t xml:space="preserve"> branch.</w:t>
+      </w:r>
+    </w:p>
+    <w:p>
+      <w:r>
+        <w:rPr>
+          <w:b/>
+        </w:rPr>
+        <w:t>1. Introducing the Bug</w:t>
+      </w:r>
+      <w:r>
+        <w:t xml:space="preserve"> A deliberate boundary bug was introduced in </w:t>
+      </w:r>
+      <w:r>
+        <w:rPr>
+          <w:rFonts w:ascii="Consolas" w:hAnsi="Consolas"/>
+          <w:color w:val="B03060"/>
+        </w:rPr>
+        <w:t>app/business_logic.py</w:t>
+      </w:r>
+      <w:r>
+        <w:t xml:space="preserve"> inside the </w:t>
+      </w:r>
+      <w:r>
+        <w:rPr>
+          <w:rFonts w:ascii="Consolas" w:hAnsi="Consolas"/>
+          <w:color w:val="B03060"/>
+        </w:rPr>
+        <w:t>check_eligibility</w:t>
+      </w:r>
+      <w:r>
+        <w:t xml:space="preserve"> function by changing </w:t>
+      </w:r>
+      <w:r>
+        <w:rPr>
+          <w:rFonts w:ascii="Consolas" w:hAnsi="Consolas"/>
+          <w:color w:val="B03060"/>
+        </w:rPr>
+        <w:t>if days_requested &lt; 1:</w:t>
+      </w:r>
+      <w:r>
+        <w:t xml:space="preserve"> to </w:t>
+      </w:r>
+      <w:r>
+        <w:rPr>
+          <w:rFonts w:ascii="Consolas" w:hAnsi="Consolas"/>
+          <w:color w:val="B03060"/>
+        </w:rPr>
+        <w:t>if days_requested &lt; 0:</w:t>
+      </w:r>
+      <w:r>
+        <w:t>. This off-by-one error incorrectly allowed 0-day leave requests to bypass the minimum validation rule.</w:t>
+      </w:r>
+    </w:p>
+    <w:p>
+      <w:r>
+        <w:rPr>
+          <w:b/>
+        </w:rPr>
+        <w:t>2. CI Pipeline Failure</w:t>
+      </w:r>
+      <w:r>
+        <w:t xml:space="preserve"> Upon pushing this change, the GitHub Actions pipeline immediately triggered and failed. The unit tests guarding the lower boundary (</w:t>
+      </w:r>
+      <w:r>
+        <w:rPr>
+          <w:rFonts w:ascii="Consolas" w:hAnsi="Consolas"/>
+          <w:color w:val="B03060"/>
+        </w:rPr>
+        <w:t>TestCheckEligibility::test_days_less_than_one</w:t>
+      </w:r>
+      <w:r>
+        <w:t xml:space="preserve"> and </w:t>
+      </w:r>
+      <w:r>
+        <w:rPr>
+          <w:rFonts w:ascii="Consolas" w:hAnsi="Consolas"/>
+          <w:color w:val="B03060"/>
+        </w:rPr>
+        <w:t>TestRule2DaysBelowMinimum::test_dt_03_day_count_below_minimum_is_refused[0]</w:t>
+      </w:r>
+      <w:r>
+        <w:t>) caught the regression, and the pipeline turned red, preventing the broken code from merging.</w:t>
+      </w:r>
+    </w:p>
+    <w:p>
+      <w:r>
+        <w:rPr>
+          <w:i/>
+        </w:rPr>
+        <w:t>[Insert screenshot of the FAILED GitHub Actions run here]</w:t>
+      </w:r>
+    </w:p>
+    <w:p>
+      <w:r>
+        <w:rPr>
+          <w:b/>
+        </w:rPr>
+        <w:t>3. Fixing the Bug</w:t>
+      </w:r>
+      <w:r>
+        <w:t xml:space="preserve"> The commit was reverted, restoring the correct </w:t>
+      </w:r>
+      <w:r>
+        <w:rPr>
+          <w:rFonts w:ascii="Consolas" w:hAnsi="Consolas"/>
+          <w:color w:val="B03060"/>
+        </w:rPr>
+        <w:t>if days_requested &lt; 1:</w:t>
+      </w:r>
+      <w:r>
+        <w:t xml:space="preserve"> check.</w:t>
+      </w:r>
+    </w:p>
+    <w:p>
+      <w:r>
+        <w:rPr>
+          <w:b/>
+        </w:rPr>
+        <w:t>4. CI Pipeline Recovery</w:t>
+      </w:r>
+      <w:r>
+        <w:t xml:space="preserve"> Upon pushing the fix, the GitHub Actions pipeline triggered again. The boundary tests passed successfully, branch coverage requirements were met, the Selenium system tests executed headlessly against a spun-up local server, and the pipeline turned green.</w:t>
+      </w:r>
+    </w:p>
+    <w:p>
+      <w:r>
+        <w:rPr>
+          <w:i/>
+        </w:rPr>
+        <w:t>[Insert screenshot of the PASSED GitHub Actions run here]</w:t>
+      </w:r>
+    </w:p>
+    <w:p>
+      <w:pPr>
+        <w:pStyle w:val="Heading1"/>
+      </w:pPr>
+      <w:r>
+        <w:t>10. Conclusion</w:t>
       </w:r>
     </w:p>
     <w:p>

</xml_diff>